<commit_message>
Almost done with intro and setup
</commit_message>
<xml_diff>
--- a/Scholes_diss_proposal.docx
+++ b/Scholes_diss_proposal.docx
@@ -93,7 +93,13 @@
         <w:jc w:val="center"/>
       </w:pPr>
       <w:r>
-        <w:t>Projected Dissertation Proposal Defense: March 2025</w:t>
+        <w:t>Projected Dissertation Proposal Defense: Ma</w:t>
+      </w:r>
+      <w:r>
+        <w:t>y</w:t>
+      </w:r>
+      <w:r>
+        <w:t xml:space="preserve"> 2025</w:t>
       </w:r>
     </w:p>
     <w:p>
@@ -119,7 +125,10 @@
         <w:t xml:space="preserve">are often used to generate inferences for a population. </w:t>
       </w:r>
       <w:r>
-        <w:t xml:space="preserve">However, as described by leading economists, “the research frontier moves to use administrative data” </w:t>
+        <w:t>However, there are drawbacks to this approach and some of them are growing more consequential. A</w:t>
+      </w:r>
+      <w:r>
+        <w:t xml:space="preserve">s described by leading economists, “the research frontier moves to use administrative data” </w:t>
       </w:r>
       <w:r>
         <w:fldChar w:fldCharType="begin"/>
@@ -164,13 +173,25 @@
         <w:t xml:space="preserve"> </w:t>
       </w:r>
       <w:r>
-        <w:t>Second, and one of the reasons that primary data collection has gotten so expensive recently, is</w:t>
+        <w:t>Second</w:t>
+      </w:r>
+      <w:r>
+        <w:t xml:space="preserve"> (</w:t>
+      </w:r>
+      <w:r>
+        <w:t xml:space="preserve">and one of the reasons that primary data collection has gotten so expensive </w:t>
+      </w:r>
+      <w:r>
+        <w:t>recently) are the</w:t>
       </w:r>
       <w:r>
         <w:t xml:space="preserve"> </w:t>
       </w:r>
       <w:r>
-        <w:t>the decline in response rates from surveys in recent years</w:t>
+        <w:t>continually declining</w:t>
+      </w:r>
+      <w:r>
+        <w:t xml:space="preserve"> response rates in recent years</w:t>
       </w:r>
       <w:r>
         <w:t xml:space="preserve">. This decline in response rates means more people have to be contacted to have the same amount of data collected because many of those contacted will opt-out or non-respond to questions. </w:t>
@@ -187,15 +208,46 @@
         <w:t>Additionally,</w:t>
       </w:r>
       <w:r>
-        <w:t xml:space="preserve"> survey data that is not longitudinal or repeated rapidly loses </w:t>
-      </w:r>
-      <w:proofErr w:type="gramStart"/>
-      <w:r>
-        <w:t>it’s</w:t>
-      </w:r>
-      <w:proofErr w:type="gramEnd"/>
-      <w:r>
-        <w:t xml:space="preserve"> value for describing current conditions and never recovers it. </w:t>
+        <w:t xml:space="preserve"> survey data that is not longitudinal or repeated rapidly loses its value for describing current conditions and never recovers it. </w:t>
+      </w:r>
+      <w:r>
+        <w:t>An additional benefit of an administrative records approach is the reduction in measurement error. Respondents only fill out certain parts of the dataset, removing</w:t>
+      </w:r>
+      <w:r>
+        <w:t xml:space="preserve"> some</w:t>
+      </w:r>
+      <w:r>
+        <w:t xml:space="preserve"> bias</w:t>
+      </w:r>
+      <w:r>
+        <w:t>es</w:t>
+      </w:r>
+      <w:r>
+        <w:t xml:space="preserve"> </w:t>
+      </w:r>
+      <w:r>
+        <w:t xml:space="preserve">from </w:t>
+      </w:r>
+      <w:r>
+        <w:t>self-report</w:t>
+      </w:r>
+      <w:r>
+        <w:t>.</w:t>
+      </w:r>
+      <w:r>
+        <w:t xml:space="preserve"> In </w:t>
+      </w:r>
+      <w:r>
+        <w:t xml:space="preserve">tandem with </w:t>
+      </w:r>
+      <w:r>
+        <w:t xml:space="preserve">reducing measurement error from self-report is the easing of respondent burden: respondent only needs to provide just enough information to match them to their other records. </w:t>
+      </w:r>
+      <w:r>
+        <w:t xml:space="preserve">This project </w:t>
+      </w:r>
+      <w:r>
+        <w:t>describes how to create a administrative data dataset to address these issues.</w:t>
       </w:r>
     </w:p>
     <w:p>
@@ -203,6 +255,74 @@
         <w:ind w:firstLine="720"/>
       </w:pPr>
       <w:r>
+        <w:t>This project also has a policy component. The data issues identified earlier have stunted the research on disaster related migration. What are the effects to the people in a community after a disaster? How long does it take for people to move back, if at all? What</w:t>
+      </w:r>
+      <w:r>
+        <w:t xml:space="preserve"> skills and demographics</w:t>
+      </w:r>
+      <w:r>
+        <w:t xml:space="preserve"> does a community lose or gain from the migration involved in a disaster? Without longitudinal and attrition-resilient methods,</w:t>
+      </w:r>
+      <w:r>
+        <w:t xml:space="preserve"> this work is</w:t>
+      </w:r>
+      <w:r>
+        <w:t xml:space="preserve"> very</w:t>
+      </w:r>
+      <w:r>
+        <w:t xml:space="preserve"> </w:t>
+      </w:r>
+      <w:r>
+        <w:t>difficult</w:t>
+      </w:r>
+      <w:r>
+        <w:t>.</w:t>
+      </w:r>
+      <w:r>
+        <w:t xml:space="preserve"> </w:t>
+      </w:r>
+      <w:r>
+        <w:t>H</w:t>
+      </w:r>
+      <w:r>
+        <w:t xml:space="preserve">ow can researchers </w:t>
+      </w:r>
+      <w:r>
+        <w:t>record outcomes if they cannot differentiate</w:t>
+      </w:r>
+      <w:r>
+        <w:t xml:space="preserve"> </w:t>
+      </w:r>
+      <w:r>
+        <w:t>between a</w:t>
+      </w:r>
+      <w:r>
+        <w:t xml:space="preserve"> respondent mov</w:t>
+      </w:r>
+      <w:r>
+        <w:t>ing</w:t>
+      </w:r>
+      <w:r>
+        <w:t>, d</w:t>
+      </w:r>
+      <w:r>
+        <w:t>ying</w:t>
+      </w:r>
+      <w:r>
+        <w:t>, or refus</w:t>
+      </w:r>
+      <w:r>
+        <w:t>ing</w:t>
+      </w:r>
+      <w:r>
+        <w:t xml:space="preserve"> to participate in the study? </w:t>
+      </w:r>
+    </w:p>
+    <w:p>
+      <w:pPr>
+        <w:ind w:firstLine="720"/>
+      </w:pPr>
+      <w:r>
         <w:t>The research frontier moves toward administrative data because it is so frequently collected and recent advancements have made it easier than ever to assemble a data set from websites, government sources, and social media sites</w:t>
       </w:r>
       <w:r>
@@ -210,6 +330,212 @@
       </w:r>
       <w:r>
         <w:t xml:space="preserve">. </w:t>
+      </w:r>
+      <w:r>
+        <w:t xml:space="preserve">In the U.S., many administrative records have their access restricted to those with a special sworn status. </w:t>
+      </w:r>
+      <w:r>
+        <w:t xml:space="preserve">Obtaining access to the administrative records is only part of the challenge. Which datasets does a researcher need, what identification strategies will </w:t>
+      </w:r>
+      <w:r>
+        <w:t xml:space="preserve">they use to match people between datasets that were never designed to work together, and can </w:t>
+      </w:r>
+      <w:r>
+        <w:t>they account for the non-probability sample t</w:t>
+      </w:r>
+      <w:r>
+        <w:t>hat they are embracing with an administrative data appr</w:t>
+      </w:r>
+      <w:r>
+        <w:t>oa</w:t>
+      </w:r>
+      <w:r>
+        <w:t>ch</w:t>
+      </w:r>
+      <w:r>
+        <w:t>?</w:t>
+      </w:r>
+    </w:p>
+    <w:p>
+      <w:pPr>
+        <w:ind w:firstLine="720"/>
+      </w:pPr>
+      <w:r>
+        <w:t>This project ex</w:t>
+      </w:r>
+      <w:r>
+        <w:t xml:space="preserve">plains how a researcher can </w:t>
+      </w:r>
+      <w:r>
+        <w:t xml:space="preserve">(1) </w:t>
+      </w:r>
+      <w:r>
+        <w:t xml:space="preserve">assemble a dataset </w:t>
+      </w:r>
+      <w:r>
+        <w:t>using unique identifiers maintained by the U.S. Census Bureau called Primary Identification Keys (PIKs).</w:t>
+      </w:r>
+      <w:r>
+        <w:t xml:space="preserve"> (2)</w:t>
+      </w:r>
+      <w:r>
+        <w:t xml:space="preserve"> I</w:t>
+      </w:r>
+      <w:r>
+        <w:t xml:space="preserve"> will rank the</w:t>
+      </w:r>
+      <w:r>
+        <w:t xml:space="preserve"> administrative records </w:t>
+      </w:r>
+      <w:r>
+        <w:t xml:space="preserve">by how many correct PIKs they </w:t>
+      </w:r>
+      <w:r>
+        <w:t>add, using the American Community Survey and the U.S. Decennial Census as separate comparators</w:t>
+      </w:r>
+      <w:r>
+        <w:t>.</w:t>
+      </w:r>
+      <w:r>
+        <w:t xml:space="preserve"> (3a)</w:t>
+      </w:r>
+      <w:r>
+        <w:t xml:space="preserve"> </w:t>
+      </w:r>
+      <w:r>
+        <w:t>I will observe the comparability of this new dataset</w:t>
+      </w:r>
+      <w:r>
+        <w:t xml:space="preserve"> — a demographic frame—</w:t>
+      </w:r>
+      <w:r>
+        <w:t xml:space="preserve"> made of administrative </w:t>
+      </w:r>
+      <w:r>
+        <w:t>records,</w:t>
+      </w:r>
+      <w:r>
+        <w:t xml:space="preserve"> to the ACS and decennial census in 2020</w:t>
+      </w:r>
+      <w:r>
+        <w:t xml:space="preserve"> by examining the coverage error for </w:t>
+      </w:r>
+      <w:r>
+        <w:t>each geography in these datasets</w:t>
+      </w:r>
+      <w:r>
+        <w:t>.</w:t>
+      </w:r>
+      <w:r>
+        <w:t xml:space="preserve"> A researcher would normally include ACS or decennial data</w:t>
+      </w:r>
+      <w:r>
+        <w:t xml:space="preserve"> into the demographic frame</w:t>
+      </w:r>
+      <w:r>
+        <w:t xml:space="preserve"> as </w:t>
+      </w:r>
+      <w:r>
+        <w:t>appropriate,</w:t>
+      </w:r>
+      <w:r>
+        <w:t xml:space="preserve"> but </w:t>
+      </w:r>
+      <w:r>
+        <w:t>I will create a</w:t>
+      </w:r>
+      <w:r>
+        <w:t xml:space="preserve"> demoframe</w:t>
+      </w:r>
+      <w:r>
+        <w:t xml:space="preserve"> that</w:t>
+      </w:r>
+      <w:r>
+        <w:t xml:space="preserve"> avoids these rich data sources</w:t>
+      </w:r>
+      <w:r>
+        <w:t>.</w:t>
+      </w:r>
+      <w:r>
+        <w:t xml:space="preserve"> </w:t>
+      </w:r>
+      <w:r>
+        <w:t xml:space="preserve">This </w:t>
+      </w:r>
+      <w:r>
+        <w:t xml:space="preserve">will </w:t>
+      </w:r>
+      <w:r>
+        <w:t>offer a conservative test for the effectiveness of a</w:t>
+      </w:r>
+      <w:r>
+        <w:t>n</w:t>
+      </w:r>
+      <w:r>
+        <w:t xml:space="preserve"> administrative records approach</w:t>
+      </w:r>
+      <w:r>
+        <w:t xml:space="preserve">. Afterwards, I will </w:t>
+      </w:r>
+      <w:r>
+        <w:t xml:space="preserve">(3b) </w:t>
+      </w:r>
+      <w:r>
+        <w:lastRenderedPageBreak/>
+        <w:t xml:space="preserve">make comparisons </w:t>
+      </w:r>
+      <w:r>
+        <w:t>with</w:t>
+      </w:r>
+      <w:r>
+        <w:t xml:space="preserve"> a demoframe that includes</w:t>
+      </w:r>
+      <w:r>
+        <w:t xml:space="preserve"> one of</w:t>
+      </w:r>
+      <w:r>
+        <w:t xml:space="preserve"> these sources</w:t>
+      </w:r>
+      <w:r>
+        <w:t xml:space="preserve"> compared against an omitted source</w:t>
+      </w:r>
+      <w:r>
+        <w:t>.</w:t>
+      </w:r>
+      <w:r>
+        <w:t xml:space="preserve"> </w:t>
+      </w:r>
+      <w:r>
+        <w:t>Having shown the ability to make estimates with the demographic frame, I will</w:t>
+      </w:r>
+      <w:r>
+        <w:t xml:space="preserve"> (4)</w:t>
+      </w:r>
+      <w:r>
+        <w:t xml:space="preserve"> estimate measure of migration, such as the in and out migration rates, with these three datasources and discuss coverage differences across </w:t>
+      </w:r>
+      <w:r>
+        <w:t>different geographies. While data is available at various g</w:t>
+      </w:r>
+      <w:r>
+        <w:t>eographic granularities</w:t>
+      </w:r>
+      <w:r>
+        <w:t xml:space="preserve">, disclosure review will determine the </w:t>
+      </w:r>
+      <w:r>
+        <w:t>g</w:t>
+      </w:r>
+      <w:r>
+        <w:t>eography statistics will be presented in. Finally</w:t>
+      </w:r>
+    </w:p>
+    <w:p>
+      <w:pPr>
+        <w:ind w:firstLine="720"/>
+      </w:pPr>
+      <w:r>
+        <w:t xml:space="preserve"> </w:t>
       </w:r>
     </w:p>
     <w:p>
@@ -258,6 +584,56 @@
     </w:sectPr>
   </w:body>
 </w:document>
+</file>
+
+<file path=word/endnotes.xml><?xml version="1.0" encoding="utf-8"?>
+<w:endnotes xmlns:wpc="http://schemas.microsoft.com/office/word/2010/wordprocessingCanvas" xmlns:cx="http://schemas.microsoft.com/office/drawing/2014/chartex" xmlns:cx1="http://schemas.microsoft.com/office/drawing/2015/9/8/chartex" xmlns:cx2="http://schemas.microsoft.com/office/drawing/2015/10/21/chartex" xmlns:cx3="http://schemas.microsoft.com/office/drawing/2016/5/9/chartex" xmlns:cx4="http://schemas.microsoft.com/office/drawing/2016/5/10/chartex" xmlns:cx5="http://schemas.microsoft.com/office/drawing/2016/5/11/chartex" xmlns:cx6="http://schemas.microsoft.com/office/drawing/2016/5/12/chartex" xmlns:cx7="http://schemas.microsoft.com/office/drawing/2016/5/13/chartex" xmlns:cx8="http://schemas.microsoft.com/office/drawing/2016/5/14/chartex" xmlns:mc="http://schemas.openxmlformats.org/markup-compatibility/2006" xmlns:aink="http://schemas.microsoft.com/office/drawing/2016/ink" xmlns:am3d="http://schemas.microsoft.com/office/drawing/2017/model3d" xmlns:o="urn:schemas-microsoft-com:office:office" xmlns:oel="http://schemas.microsoft.com/office/2019/extlst" xmlns:r="http://schemas.openxmlformats.org/officeDocument/2006/relationships" xmlns:m="http://schemas.openxmlformats.org/officeDocument/2006/math" xmlns:v="urn:schemas-microsoft-com:vml" xmlns:wp14="http://schemas.microsoft.com/office/word/2010/wordprocessingDrawing" xmlns:wp="http://schemas.openxmlformats.org/drawingml/2006/wordprocessingDrawing" xmlns:w10="urn:schemas-microsoft-com:office:word" xmlns:w="http://schemas.openxmlformats.org/wordprocessingml/2006/main" xmlns:w14="http://schemas.microsoft.com/office/word/2010/wordml" xmlns:w15="http://schemas.microsoft.com/office/word/2012/wordml" xmlns:w16cex="http://schemas.microsoft.com/office/word/2018/wordml/cex" xmlns:w16cid="http://schemas.microsoft.com/office/word/2016/wordml/cid" xmlns:w16="http://schemas.microsoft.com/office/word/2018/wordml" xmlns:w16du="http://schemas.microsoft.com/office/word/2023/wordml/word16du" xmlns:w16sdtdh="http://schemas.microsoft.com/office/word/2020/wordml/sdtdatahash" xmlns:w16sdtfl="http://schemas.microsoft.com/office/word/2024/wordml/sdtformatlock" xmlns:w16se="http://schemas.microsoft.com/office/word/2015/wordml/symex" xmlns:wpg="http://schemas.microsoft.com/office/word/2010/wordprocessingGroup" xmlns:wpi="http://schemas.microsoft.com/office/word/2010/wordprocessingInk" xmlns:wne="http://schemas.microsoft.com/office/word/2006/wordml" xmlns:wps="http://schemas.microsoft.com/office/word/2010/wordprocessingShape" mc:Ignorable="w14 w15 w16se w16cid w16 w16cex w16sdtdh w16sdtfl w16du wp14">
+  <w:endnote w:type="separator" w:id="-1">
+    <w:p>
+      <w:pPr>
+        <w:spacing w:after="0" w:line="240" w:lineRule="auto"/>
+      </w:pPr>
+      <w:r>
+        <w:separator/>
+      </w:r>
+    </w:p>
+  </w:endnote>
+  <w:endnote w:type="continuationSeparator" w:id="0">
+    <w:p>
+      <w:pPr>
+        <w:spacing w:after="0" w:line="240" w:lineRule="auto"/>
+      </w:pPr>
+      <w:r>
+        <w:continuationSeparator/>
+      </w:r>
+    </w:p>
+  </w:endnote>
+</w:endnotes>
+</file>
+
+<file path=word/footnotes.xml><?xml version="1.0" encoding="utf-8"?>
+<w:footnotes xmlns:wpc="http://schemas.microsoft.com/office/word/2010/wordprocessingCanvas" xmlns:cx="http://schemas.microsoft.com/office/drawing/2014/chartex" xmlns:cx1="http://schemas.microsoft.com/office/drawing/2015/9/8/chartex" xmlns:cx2="http://schemas.microsoft.com/office/drawing/2015/10/21/chartex" xmlns:cx3="http://schemas.microsoft.com/office/drawing/2016/5/9/chartex" xmlns:cx4="http://schemas.microsoft.com/office/drawing/2016/5/10/chartex" xmlns:cx5="http://schemas.microsoft.com/office/drawing/2016/5/11/chartex" xmlns:cx6="http://schemas.microsoft.com/office/drawing/2016/5/12/chartex" xmlns:cx7="http://schemas.microsoft.com/office/drawing/2016/5/13/chartex" xmlns:cx8="http://schemas.microsoft.com/office/drawing/2016/5/14/chartex" xmlns:mc="http://schemas.openxmlformats.org/markup-compatibility/2006" xmlns:aink="http://schemas.microsoft.com/office/drawing/2016/ink" xmlns:am3d="http://schemas.microsoft.com/office/drawing/2017/model3d" xmlns:o="urn:schemas-microsoft-com:office:office" xmlns:oel="http://schemas.microsoft.com/office/2019/extlst" xmlns:r="http://schemas.openxmlformats.org/officeDocument/2006/relationships" xmlns:m="http://schemas.openxmlformats.org/officeDocument/2006/math" xmlns:v="urn:schemas-microsoft-com:vml" xmlns:wp14="http://schemas.microsoft.com/office/word/2010/wordprocessingDrawing" xmlns:wp="http://schemas.openxmlformats.org/drawingml/2006/wordprocessingDrawing" xmlns:w10="urn:schemas-microsoft-com:office:word" xmlns:w="http://schemas.openxmlformats.org/wordprocessingml/2006/main" xmlns:w14="http://schemas.microsoft.com/office/word/2010/wordml" xmlns:w15="http://schemas.microsoft.com/office/word/2012/wordml" xmlns:w16cex="http://schemas.microsoft.com/office/word/2018/wordml/cex" xmlns:w16cid="http://schemas.microsoft.com/office/word/2016/wordml/cid" xmlns:w16="http://schemas.microsoft.com/office/word/2018/wordml" xmlns:w16du="http://schemas.microsoft.com/office/word/2023/wordml/word16du" xmlns:w16sdtdh="http://schemas.microsoft.com/office/word/2020/wordml/sdtdatahash" xmlns:w16sdtfl="http://schemas.microsoft.com/office/word/2024/wordml/sdtformatlock" xmlns:w16se="http://schemas.microsoft.com/office/word/2015/wordml/symex" xmlns:wpg="http://schemas.microsoft.com/office/word/2010/wordprocessingGroup" xmlns:wpi="http://schemas.microsoft.com/office/word/2010/wordprocessingInk" xmlns:wne="http://schemas.microsoft.com/office/word/2006/wordml" xmlns:wps="http://schemas.microsoft.com/office/word/2010/wordprocessingShape" mc:Ignorable="w14 w15 w16se w16cid w16 w16cex w16sdtdh w16sdtfl w16du wp14">
+  <w:footnote w:type="separator" w:id="-1">
+    <w:p>
+      <w:pPr>
+        <w:spacing w:after="0" w:line="240" w:lineRule="auto"/>
+      </w:pPr>
+      <w:r>
+        <w:separator/>
+      </w:r>
+    </w:p>
+  </w:footnote>
+  <w:footnote w:type="continuationSeparator" w:id="0">
+    <w:p>
+      <w:pPr>
+        <w:spacing w:after="0" w:line="240" w:lineRule="auto"/>
+      </w:pPr>
+      <w:r>
+        <w:continuationSeparator/>
+      </w:r>
+    </w:p>
+  </w:footnote>
+</w:footnotes>
 </file>
 
 <file path=word/styles.xml><?xml version="1.0" encoding="utf-8"?>
@@ -863,6 +1239,7 @@
   <w:style w:type="character" w:default="1" w:styleId="DefaultParagraphFont">
     <w:name w:val="Default Paragraph Font"/>
     <w:uiPriority w:val="1"/>
+    <w:semiHidden/>
     <w:unhideWhenUsed/>
   </w:style>
   <w:style w:type="table" w:default="1" w:styleId="TableNormal">
@@ -1175,6 +1552,50 @@
       <w:color w:val="0F4761" w:themeColor="accent1" w:themeShade="BF"/>
       <w:spacing w:val="5"/>
     </w:rPr>
+  </w:style>
+  <w:style w:type="paragraph" w:styleId="Header">
+    <w:name w:val="header"/>
+    <w:basedOn w:val="Normal"/>
+    <w:link w:val="HeaderChar"/>
+    <w:uiPriority w:val="99"/>
+    <w:unhideWhenUsed/>
+    <w:rsid w:val="002F1A57"/>
+    <w:pPr>
+      <w:tabs>
+        <w:tab w:val="center" w:pos="4680"/>
+        <w:tab w:val="right" w:pos="9360"/>
+      </w:tabs>
+      <w:spacing w:after="0" w:line="240" w:lineRule="auto"/>
+    </w:pPr>
+  </w:style>
+  <w:style w:type="character" w:customStyle="1" w:styleId="HeaderChar">
+    <w:name w:val="Header Char"/>
+    <w:basedOn w:val="DefaultParagraphFont"/>
+    <w:link w:val="Header"/>
+    <w:uiPriority w:val="99"/>
+    <w:rsid w:val="002F1A57"/>
+  </w:style>
+  <w:style w:type="paragraph" w:styleId="Footer">
+    <w:name w:val="footer"/>
+    <w:basedOn w:val="Normal"/>
+    <w:link w:val="FooterChar"/>
+    <w:uiPriority w:val="99"/>
+    <w:unhideWhenUsed/>
+    <w:rsid w:val="002F1A57"/>
+    <w:pPr>
+      <w:tabs>
+        <w:tab w:val="center" w:pos="4680"/>
+        <w:tab w:val="right" w:pos="9360"/>
+      </w:tabs>
+      <w:spacing w:after="0" w:line="240" w:lineRule="auto"/>
+    </w:pPr>
+  </w:style>
+  <w:style w:type="character" w:customStyle="1" w:styleId="FooterChar">
+    <w:name w:val="Footer Char"/>
+    <w:basedOn w:val="DefaultParagraphFont"/>
+    <w:link w:val="Footer"/>
+    <w:uiPriority w:val="99"/>
+    <w:rsid w:val="002F1A57"/>
   </w:style>
 </w:styles>
 </file>

</xml_diff>